<commit_message>
Remove placeholders with source-supported wording; add .docm export
Sentences that needed values only available in the experiment code now state only what the
original manuscript supports. Adds to_docm.py and a macro-enabled .docm build output.

Co-Authored-By: Claude Opus 5.5 <noreply@anthropic.com>
Claude-Session: https://claude.ai/code/session_01N5hfqEt1Nergf7js5PTLwW
</commit_message>
<xml_diff>
--- a/manuscript/StegaGuard_revised.docx
+++ b/manuscript/StegaGuard_revised.docx
@@ -2019,16 +2019,7 @@
         <w:t xml:space="preserve">[19]</w:t>
       </w:r>
       <w:r>
-        <w:t xml:space="preserve">. We drew 600 of them (6%) with the fixed seed 20260918 and downsampled each to 256 × 256 with </w:t>
-      </w:r>
-      <w:r>
-        <w:rPr>
-          <w:highlight w:val="yellow"/>
-        </w:rPr>
-        <w:t xml:space="preserve">[resizing function and interpolation]</w:t>
-      </w:r>
-      <w:r>
-        <w:t xml:space="preserve">, as several CNN studies do </w:t>
+        <w:t xml:space="preserve">. We drew 600 of them (6%) with the fixed seed 20260918 and downsampled each to 256 × 256 before embedding, as several CNN studies do </w:t>
       </w:r>
       <w:r>
         <w:t xml:space="preserve">[8, 9]</w:t>
@@ -2040,16 +2031,7 @@
     <w:p>
       <w:pPr/>
       <w:r>
-        <w:t xml:space="preserve">Leakage is prevented by the order of operations. The 600 source covers were first assigned to training (360), validation (120) and test (120) by </w:t>
-      </w:r>
-      <w:r>
-        <w:rPr>
-          <w:highlight w:val="yellow"/>
-        </w:rPr>
-        <w:t xml:space="preserve">[split procedure, e.g. random permutation with seed 20260918]</w:t>
-      </w:r>
-      <w:r>
-        <w:t xml:space="preserve">. Only then was each cover embedded with WOW </w:t>
+        <w:t xml:space="preserve">Leakage is prevented by the order of operations. The 600 source covers were first assigned to training (360), validation (120) and test (120). Only then was each cover embedded with WOW </w:t>
       </w:r>
       <w:r>
         <w:t xml:space="preserve">[2]</w:t>
@@ -2067,16 +2049,7 @@
         <w:t xml:space="preserve">[4]</w:t>
       </w:r>
       <w:r>
-        <w:t xml:space="preserve"> at 0.1 and 0.4 bpp using </w:t>
-      </w:r>
-      <w:r>
-        <w:rPr>
-          <w:highlight w:val="yellow"/>
-        </w:rPr>
-        <w:t xml:space="preserve">[embedding implementation and version]</w:t>
-      </w:r>
-      <w:r>
-        <w:t xml:space="preserve">, giving six variants per cover: 600 stego images per algorithm–payload condition, 3,600 in total and 4,200 PNG files with the covers. Training, validation and test hold 2,160, 720 and 720 stego images (360, 120 and 120 per condition). Each stego file inherits the cover_id and split of its source, so a cover and its six variants always share a partition. The manifest records cover_id, split, algorithm, payload, embedding seed and SHA-256 hash; an audit confirmed that every cover_id lies in exactly one partition with exactly six variants and that no cover_id overlaps (manifest SHA-256 13c01ca9…2799e8c).</w:t>
+        <w:t xml:space="preserve"> at 0.1 and 0.4 bpp, giving six variants per cover: 600 stego images per algorithm–payload condition, 3,600 in total and 4,200 PNG files with the covers. Training, validation and test hold 2,160, 720 and 720 stego images (360, 120 and 120 per condition). Each stego file inherits the cover_id and split of its source, so a cover and its six variants always share a partition. The manifest records cover_id, split, algorithm, payload, embedding seed and SHA-256 hash; an audit confirmed that every cover_id lies in exactly one partition with exactly six variants and that no cover_id overlaps (manifest SHA-256 13c01ca9…2799e8c).</w:t>
       </w:r>
     </w:p>
     <w:p>
@@ -2103,43 +2076,7 @@
         </w:r>
       </w:fldSimple>
       <w:r>
-        <w:t xml:space="preserve"> lists their settings. Residual-LR, the lightweight baseline, applies </w:t>
-      </w:r>
-      <w:r>
-        <w:rPr>
-          <w:highlight w:val="yellow"/>
-        </w:rPr>
-        <w:t xml:space="preserve">[K high-pass residual filters, listed]</w:t>
-      </w:r>
-      <w:r>
-        <w:t xml:space="preserve"> to each image and summarizes every residual map with </w:t>
-      </w:r>
-      <w:r>
-        <w:rPr>
-          <w:highlight w:val="yellow"/>
-        </w:rPr>
-        <w:t xml:space="preserve">[M statistics, listed]</w:t>
-      </w:r>
-      <w:r>
-        <w:t xml:space="preserve">, giving 76 features (K × M = 76). They are scaled with </w:t>
-      </w:r>
-      <w:r>
-        <w:rPr>
-          <w:highlight w:val="yellow"/>
-        </w:rPr>
-        <w:t xml:space="preserve">[scaler]</w:t>
-      </w:r>
-      <w:r>
-        <w:t xml:space="preserve"> fitted on the training pairs of the run only </w:t>
-      </w:r>
-      <w:r>
-        <w:rPr>
-          <w:highlight w:val="yellow"/>
-        </w:rPr>
-        <w:t xml:space="preserve">[confirm]</w:t>
-      </w:r>
-      <w:r>
-        <w:t xml:space="preserve"> and fed to scikit-learn logistic regression </w:t>
+        <w:t xml:space="preserve"> summarizes their configuration. Residual-LR, the lightweight baseline, describes each image by 76 statistics of its noise residuals and classifies them with scikit-learn logistic regression </w:t>
       </w:r>
       <w:r>
         <w:t xml:space="preserve">[20]</w:t>
@@ -2163,7 +2100,7 @@
         <w:t xml:space="preserve">[7]</w:t>
       </w:r>
       <w:r>
-        <w:t xml:space="preserve">: each of L = 50 base learners uses d</w:t>
+        <w:t xml:space="preserve"> with L = 50 base learners and random feature subspaces of dimension d</w:t>
       </w:r>
       <w:r>
         <w:rPr>
@@ -2172,22 +2109,12 @@
         <w:t xml:space="preserve">sub</w:t>
       </w:r>
       <w:r>
-        <w:t xml:space="preserve"> = 500 random features and a bootstrap sample of the training pairs. L and d</w:t>
-      </w:r>
-      <w:r>
-        <w:rPr>
-          <w:vertAlign w:val="subscript"/>
-        </w:rPr>
-        <w:t xml:space="preserve">sub</w:t>
-      </w:r>
-      <w:r>
-        <w:t xml:space="preserve"> were fixed in advance rather than tuned by out-of-bag search, so the classifier is identical across protocols.</w:t>
+        <w:t xml:space="preserve"> = 500. Both detectors keep the same settings in every protocol and seed, so differences between protocols come from the training data alone.</w:t>
       </w:r>
     </w:p>
     <w:p>
       <w:pPr>
         <w:pStyle w:val="tablecaption"/>
-        <w:jc w:val="both"/>
       </w:pPr>
       <w:r>
         <w:rPr>
@@ -2215,7 +2142,7 @@
         <w:t xml:space="preserve">. </w:t>
       </w:r>
       <w:r>
-        <w:t xml:space="preserve">Detector configuration. Highlighted entries are to be confirmed against the code of the reported runs.</w:t>
+        <w:t xml:space="preserve">Detector configuration.</w:t>
       </w:r>
     </w:p>
     <w:tbl>
@@ -2345,7 +2272,7 @@
                 <w:sz w:val="17"/>
                 <w:szCs w:val="17"/>
               </w:rPr>
-              <w:t xml:space="preserve">Feature scaling</w:t>
+              <w:t xml:space="preserve">Features</w:t>
             </w:r>
           </w:p>
         </w:tc>
@@ -2365,16 +2292,8 @@
               <w:rPr>
                 <w:sz w:val="17"/>
                 <w:szCs w:val="17"/>
-                <w:highlight w:val="yellow"/>
-              </w:rPr>
-              <w:t xml:space="preserve">[scaler]</w:t>
-            </w:r>
-            <w:r>
-              <w:rPr>
-                <w:sz w:val="17"/>
-                <w:szCs w:val="17"/>
-              </w:rPr>
-              <w:t xml:space="preserve">, fit on training pairs only</w:t>
+              </w:rPr>
+              <w:t xml:space="preserve">76 residual statistics</w:t>
             </w:r>
           </w:p>
         </w:tc>
@@ -2394,9 +2313,8 @@
               <w:rPr>
                 <w:sz w:val="17"/>
                 <w:szCs w:val="17"/>
-                <w:highlight w:val="yellow"/>
-              </w:rPr>
-              <w:t xml:space="preserve">[none / as implemented]</w:t>
+              </w:rPr>
+              <w:t xml:space="preserve">SRM: 106 submodels, 34,671 dimensions</w:t>
             </w:r>
           </w:p>
         </w:tc>
@@ -2422,7 +2340,7 @@
                 <w:sz w:val="17"/>
                 <w:szCs w:val="17"/>
               </w:rPr>
-              <w:t xml:space="preserve">Classifier (library)</w:t>
+              <w:t xml:space="preserve">Classifier</w:t>
             </w:r>
           </w:p>
         </w:tc>
@@ -2443,22 +2361,7 @@
                 <w:sz w:val="17"/>
                 <w:szCs w:val="17"/>
               </w:rPr>
-              <w:t xml:space="preserve">logistic regression (scikit-learn </w:t>
-            </w:r>
-            <w:r>
-              <w:rPr>
-                <w:sz w:val="17"/>
-                <w:szCs w:val="17"/>
-                <w:highlight w:val="yellow"/>
-              </w:rPr>
-              <w:t xml:space="preserve">[ver.]</w:t>
-            </w:r>
-            <w:r>
-              <w:rPr>
-                <w:sz w:val="17"/>
-                <w:szCs w:val="17"/>
-              </w:rPr>
-              <w:t xml:space="preserve">)</w:t>
+              <w:t xml:space="preserve">logistic regression (scikit-learn)</w:t>
             </w:r>
           </w:p>
         </w:tc>
@@ -2479,22 +2382,22 @@
                 <w:sz w:val="17"/>
                 <w:szCs w:val="17"/>
               </w:rPr>
-              <w:t xml:space="preserve">FLD ensemble (sealwatch </w:t>
-            </w:r>
-            <w:r>
-              <w:rPr>
-                <w:sz w:val="17"/>
-                <w:szCs w:val="17"/>
-                <w:highlight w:val="yellow"/>
-              </w:rPr>
-              <w:t xml:space="preserve">[ver.]</w:t>
-            </w:r>
-            <w:r>
-              <w:rPr>
-                <w:sz w:val="17"/>
-                <w:szCs w:val="17"/>
-              </w:rPr>
-              <w:t xml:space="preserve">)</w:t>
+              <w:t xml:space="preserve">FLD ensemble, L = 50, d</w:t>
+            </w:r>
+            <w:r>
+              <w:rPr>
+                <w:sz w:val="17"/>
+                <w:szCs w:val="17"/>
+                <w:vertAlign w:val="subscript"/>
+              </w:rPr>
+              <w:t xml:space="preserve">sub</w:t>
+            </w:r>
+            <w:r>
+              <w:rPr>
+                <w:sz w:val="17"/>
+                <w:szCs w:val="17"/>
+              </w:rPr>
+              <w:t xml:space="preserve"> = 500</w:t>
             </w:r>
           </w:p>
         </w:tc>
@@ -2520,7 +2423,7 @@
                 <w:sz w:val="17"/>
                 <w:szCs w:val="17"/>
               </w:rPr>
-              <w:t xml:space="preserve">Main parameters</w:t>
+              <w:t xml:space="preserve">Training data per run</w:t>
             </w:r>
           </w:p>
         </w:tc>
@@ -2541,75 +2444,7 @@
                 <w:sz w:val="17"/>
                 <w:szCs w:val="17"/>
               </w:rPr>
-              <w:t xml:space="preserve">solver </w:t>
-            </w:r>
-            <w:r>
-              <w:rPr>
-                <w:sz w:val="17"/>
-                <w:szCs w:val="17"/>
-                <w:highlight w:val="yellow"/>
-              </w:rPr>
-              <w:t xml:space="preserve">[ ]</w:t>
-            </w:r>
-            <w:r>
-              <w:rPr>
-                <w:sz w:val="17"/>
-                <w:szCs w:val="17"/>
-              </w:rPr>
-              <w:t xml:space="preserve">, penalty and C </w:t>
-            </w:r>
-            <w:r>
-              <w:rPr>
-                <w:sz w:val="17"/>
-                <w:szCs w:val="17"/>
-                <w:highlight w:val="yellow"/>
-              </w:rPr>
-              <w:t xml:space="preserve">[ ]</w:t>
-            </w:r>
-            <w:r>
-              <w:rPr>
-                <w:sz w:val="17"/>
-                <w:szCs w:val="17"/>
-              </w:rPr>
-              <w:t xml:space="preserve">, class_weight </w:t>
-            </w:r>
-            <w:r>
-              <w:rPr>
-                <w:sz w:val="17"/>
-                <w:szCs w:val="17"/>
-                <w:highlight w:val="yellow"/>
-              </w:rPr>
-              <w:t xml:space="preserve">[ ]</w:t>
-            </w:r>
-            <w:r>
-              <w:rPr>
-                <w:sz w:val="17"/>
-                <w:szCs w:val="17"/>
-              </w:rPr>
-              <w:t xml:space="preserve">, max_iter </w:t>
-            </w:r>
-            <w:r>
-              <w:rPr>
-                <w:sz w:val="17"/>
-                <w:szCs w:val="17"/>
-                <w:highlight w:val="yellow"/>
-              </w:rPr>
-              <w:t xml:space="preserve">[ ]</w:t>
-            </w:r>
-            <w:r>
-              <w:rPr>
-                <w:sz w:val="17"/>
-                <w:szCs w:val="17"/>
-              </w:rPr>
-              <w:t xml:space="preserve">, random_state </w:t>
-            </w:r>
-            <w:r>
-              <w:rPr>
-                <w:sz w:val="17"/>
-                <w:szCs w:val="17"/>
-                <w:highlight w:val="yellow"/>
-              </w:rPr>
-              <w:t xml:space="preserve">[ ]</w:t>
+              <w:t xml:space="preserve">360 cover–stego pairs</w:t>
             </w:r>
           </w:p>
         </w:tc>
@@ -2630,22 +2465,7 @@
                 <w:sz w:val="17"/>
                 <w:szCs w:val="17"/>
               </w:rPr>
-              <w:t xml:space="preserve">L = 50, d</w:t>
-            </w:r>
-            <w:r>
-              <w:rPr>
-                <w:sz w:val="17"/>
-                <w:szCs w:val="17"/>
-                <w:vertAlign w:val="subscript"/>
-              </w:rPr>
-              <w:t xml:space="preserve">sub</w:t>
-            </w:r>
-            <w:r>
-              <w:rPr>
-                <w:sz w:val="17"/>
-                <w:szCs w:val="17"/>
-              </w:rPr>
-              <w:t xml:space="preserve"> = 500, bootstrap of training pairs, seeded subspaces</w:t>
+              <w:t xml:space="preserve">360 cover–stego pairs</w:t>
             </w:r>
           </w:p>
         </w:tc>
@@ -2661,6 +2481,7 @@
           </w:tcPr>
           <w:p>
             <w:pPr>
+              <w:keepNext/>
               <w:spacing w:before="10" w:after="10" w:line="216" w:lineRule="auto"/>
               <w:ind w:firstLine="0"/>
               <w:jc w:val="left"/>
@@ -2670,7 +2491,7 @@
                 <w:sz w:val="17"/>
                 <w:szCs w:val="17"/>
               </w:rPr>
-              <w:t xml:space="preserve">Score</w:t>
+              <w:t xml:space="preserve">Seed-dependent parts</w:t>
             </w:r>
           </w:p>
         </w:tc>
@@ -2681,6 +2502,7 @@
           </w:tcPr>
           <w:p>
             <w:pPr>
+              <w:keepNext/>
               <w:spacing w:before="10" w:after="10" w:line="216" w:lineRule="auto"/>
               <w:ind w:firstLine="0"/>
               <w:jc w:val="left"/>
@@ -2690,7 +2512,7 @@
                 <w:sz w:val="17"/>
                 <w:szCs w:val="17"/>
               </w:rPr>
-              <w:t xml:space="preserve">predicted probability of stego</w:t>
+              <w:t xml:space="preserve">variant sampling (P2, P3)</w:t>
             </w:r>
           </w:p>
         </w:tc>
@@ -2701,6 +2523,7 @@
           </w:tcPr>
           <w:p>
             <w:pPr>
+              <w:keepNext/>
               <w:spacing w:before="10" w:after="10" w:line="216" w:lineRule="auto"/>
               <w:ind w:firstLine="0"/>
               <w:jc w:val="left"/>
@@ -2709,9 +2532,73 @@
               <w:rPr>
                 <w:sz w:val="17"/>
                 <w:szCs w:val="17"/>
-                <w:highlight w:val="yellow"/>
-              </w:rPr>
-              <w:t xml:space="preserve">[vote fraction or summed FLD projections]</w:t>
+              </w:rPr>
+              <w:t xml:space="preserve">variant sampling (P2, P3); random parts of ensemble training</w:t>
+            </w:r>
+          </w:p>
+        </w:tc>
+      </w:tr>
+      <w:tr>
+        <w:trPr>
+          <w:cantSplit/>
+        </w:trPr>
+        <w:tc>
+          <w:tcPr>
+            <w:tcW w:w="1650" w:type="dxa"/>
+            <w:vAlign w:val="center"/>
+          </w:tcPr>
+          <w:p>
+            <w:pPr>
+              <w:spacing w:before="10" w:after="10" w:line="216" w:lineRule="auto"/>
+              <w:ind w:firstLine="0"/>
+              <w:jc w:val="left"/>
+            </w:pPr>
+            <w:r>
+              <w:rPr>
+                <w:sz w:val="17"/>
+                <w:szCs w:val="17"/>
+              </w:rPr>
+              <w:t xml:space="preserve">Output</w:t>
+            </w:r>
+          </w:p>
+        </w:tc>
+        <w:tc>
+          <w:tcPr>
+            <w:tcW w:w="2634" w:type="dxa"/>
+            <w:vAlign w:val="center"/>
+          </w:tcPr>
+          <w:p>
+            <w:pPr>
+              <w:spacing w:before="10" w:after="10" w:line="216" w:lineRule="auto"/>
+              <w:ind w:firstLine="0"/>
+              <w:jc w:val="left"/>
+            </w:pPr>
+            <w:r>
+              <w:rPr>
+                <w:sz w:val="17"/>
+                <w:szCs w:val="17"/>
+              </w:rPr>
+              <w:t xml:space="preserve">real-valued score, higher for stego</w:t>
+            </w:r>
+          </w:p>
+        </w:tc>
+        <w:tc>
+          <w:tcPr>
+            <w:tcW w:w="2634" w:type="dxa"/>
+            <w:vAlign w:val="center"/>
+          </w:tcPr>
+          <w:p>
+            <w:pPr>
+              <w:spacing w:before="10" w:after="10" w:line="216" w:lineRule="auto"/>
+              <w:ind w:firstLine="0"/>
+              <w:jc w:val="left"/>
+            </w:pPr>
+            <w:r>
+              <w:rPr>
+                <w:sz w:val="17"/>
+                <w:szCs w:val="17"/>
+              </w:rPr>
+              <w:t xml:space="preserve">real-valued score, higher for stego</w:t>
             </w:r>
           </w:p>
         </w:tc>
@@ -2746,25 +2633,7 @@
         </w:r>
       </w:fldSimple>
       <w:r>
-        <w:t xml:space="preserve"> differ only in the stego variant attached to each of the 360 training covers. For every training cover and seed, one variant is drawn </w:t>
-      </w:r>
-      <w:r>
-        <w:rPr>
-          <w:highlight w:val="yellow"/>
-        </w:rPr>
-        <w:t xml:space="preserve">[uniformly at random]</w:t>
-      </w:r>
-      <w:r>
-        <w:t xml:space="preserve"> from the protocol's pool, so each run sees 360 cover–stego pairs built from the same 360 covers; P1 involves no sampling. Validation covers are paired in the same way </w:t>
-      </w:r>
-      <w:r>
-        <w:rPr>
-          <w:highlight w:val="yellow"/>
-        </w:rPr>
-        <w:t xml:space="preserve">[confirm]</w:t>
-      </w:r>
-      <w:r>
-        <w:t xml:space="preserve"> and serve only for thresholds. HILL never enters training or validation, and S-UNIWARD is unseen under P1. Seeds 42, 43 and 44 control the variant draws and the random parts of model fitting.</w:t>
+        <w:t xml:space="preserve"> differ only in the stego variant attached to each of the 360 training covers. For every training cover and seed, one variant is sampled from the protocol's pool, so each run sees 360 cover–stego pairs built from the same 360 covers; P1 involves no sampling. Validation images serve only to set thresholds. HILL never enters training or validation, and S-UNIWARD is unseen under P1. Seeds 42, 43 and 44 control the variant draws and the random parts of model fitting.</w:t>
       </w:r>
     </w:p>
     <w:p>
@@ -2820,9 +2689,9 @@
       </w:tblPr>
       <w:tblGrid>
         <w:gridCol w:w="600"/>
-        <w:gridCol w:w="2350"/>
-        <w:gridCol w:w="1500"/>
-        <w:gridCol w:w="2468"/>
+        <w:gridCol w:w="2500"/>
+        <w:gridCol w:w="1050"/>
+        <w:gridCol w:w="2768"/>
       </w:tblGrid>
       <w:tr>
         <w:trPr>
@@ -2857,7 +2726,7 @@
         </w:tc>
         <w:tc>
           <w:tcPr>
-            <w:tcW w:w="2350" w:type="dxa"/>
+            <w:tcW w:w="2500" w:type="dxa"/>
             <w:tcBorders>
               <w:bottom w:val="single" w:sz="4" w:space="0" w:color="000000"/>
             </w:tcBorders>
@@ -2877,13 +2746,13 @@
                 <w:sz w:val="17"/>
                 <w:szCs w:val="17"/>
               </w:rPr>
-              <w:t xml:space="preserve">Training/validation stego pool</w:t>
-            </w:r>
-          </w:p>
-        </w:tc>
-        <w:tc>
-          <w:tcPr>
-            <w:tcW w:w="1500" w:type="dxa"/>
+              <w:t xml:space="preserve">Training stego pool</w:t>
+            </w:r>
+          </w:p>
+        </w:tc>
+        <w:tc>
+          <w:tcPr>
+            <w:tcW w:w="1050" w:type="dxa"/>
             <w:tcBorders>
               <w:bottom w:val="single" w:sz="4" w:space="0" w:color="000000"/>
             </w:tcBorders>
@@ -2903,13 +2772,13 @@
                 <w:sz w:val="17"/>
                 <w:szCs w:val="17"/>
               </w:rPr>
-              <w:t xml:space="preserve">Expected training pairs</w:t>
-            </w:r>
-          </w:p>
-        </w:tc>
-        <w:tc>
-          <w:tcPr>
-            <w:tcW w:w="2468" w:type="dxa"/>
+              <w:t xml:space="preserve">Variants in pool</w:t>
+            </w:r>
+          </w:p>
+        </w:tc>
+        <w:tc>
+          <w:tcPr>
+            <w:tcW w:w="2768" w:type="dxa"/>
             <w:tcBorders>
               <w:bottom w:val="single" w:sz="4" w:space="0" w:color="000000"/>
             </w:tcBorders>
@@ -2961,7 +2830,7 @@
         </w:tc>
         <w:tc>
           <w:tcPr>
-            <w:tcW w:w="2350" w:type="dxa"/>
+            <w:tcW w:w="2500" w:type="dxa"/>
             <w:vAlign w:val="center"/>
           </w:tcPr>
           <w:p>
@@ -2982,7 +2851,7 @@
         </w:tc>
         <w:tc>
           <w:tcPr>
-            <w:tcW w:w="1500" w:type="dxa"/>
+            <w:tcW w:w="1050" w:type="dxa"/>
             <w:vAlign w:val="center"/>
           </w:tcPr>
           <w:p>
@@ -2997,13 +2866,13 @@
                 <w:sz w:val="17"/>
                 <w:szCs w:val="17"/>
               </w:rPr>
-              <w:t xml:space="preserve">360 WOW 0.4</w:t>
-            </w:r>
-          </w:p>
-        </w:tc>
-        <w:tc>
-          <w:tcPr>
-            <w:tcW w:w="2468" w:type="dxa"/>
+              <w:t xml:space="preserve">1</w:t>
+            </w:r>
+          </w:p>
+        </w:tc>
+        <w:tc>
+          <w:tcPr>
+            <w:tcW w:w="2768" w:type="dxa"/>
             <w:vAlign w:val="center"/>
           </w:tcPr>
           <w:p>
@@ -3050,7 +2919,7 @@
         </w:tc>
         <w:tc>
           <w:tcPr>
-            <w:tcW w:w="2350" w:type="dxa"/>
+            <w:tcW w:w="2500" w:type="dxa"/>
             <w:vAlign w:val="center"/>
           </w:tcPr>
           <w:p>
@@ -3071,7 +2940,7 @@
         </w:tc>
         <w:tc>
           <w:tcPr>
-            <w:tcW w:w="1500" w:type="dxa"/>
+            <w:tcW w:w="1050" w:type="dxa"/>
             <w:vAlign w:val="center"/>
           </w:tcPr>
           <w:p>
@@ -3086,13 +2955,13 @@
                 <w:sz w:val="17"/>
                 <w:szCs w:val="17"/>
               </w:rPr>
-              <w:t xml:space="preserve">≈180 per algorithm</w:t>
-            </w:r>
-          </w:p>
-        </w:tc>
-        <w:tc>
-          <w:tcPr>
-            <w:tcW w:w="2468" w:type="dxa"/>
+              <w:t xml:space="preserve">2</w:t>
+            </w:r>
+          </w:p>
+        </w:tc>
+        <w:tc>
+          <w:tcPr>
+            <w:tcW w:w="2768" w:type="dxa"/>
             <w:vAlign w:val="center"/>
           </w:tcPr>
           <w:p>
@@ -3138,7 +3007,7 @@
         </w:tc>
         <w:tc>
           <w:tcPr>
-            <w:tcW w:w="2350" w:type="dxa"/>
+            <w:tcW w:w="2500" w:type="dxa"/>
             <w:vAlign w:val="center"/>
           </w:tcPr>
           <w:p>
@@ -3158,7 +3027,7 @@
         </w:tc>
         <w:tc>
           <w:tcPr>
-            <w:tcW w:w="1500" w:type="dxa"/>
+            <w:tcW w:w="1050" w:type="dxa"/>
             <w:vAlign w:val="center"/>
           </w:tcPr>
           <w:p>
@@ -3172,13 +3041,13 @@
                 <w:sz w:val="17"/>
                 <w:szCs w:val="17"/>
               </w:rPr>
-              <w:t xml:space="preserve">≈90 per combination</w:t>
-            </w:r>
-          </w:p>
-        </w:tc>
-        <w:tc>
-          <w:tcPr>
-            <w:tcW w:w="2468" w:type="dxa"/>
+              <w:t xml:space="preserve">4</w:t>
+            </w:r>
+          </w:p>
+        </w:tc>
+        <w:tc>
+          <w:tcPr>
+            <w:tcW w:w="2768" w:type="dxa"/>
             <w:vAlign w:val="center"/>
           </w:tcPr>
           <w:p>
@@ -3251,7 +3120,7 @@
         <w:t xml:space="preserve">MD</w:t>
       </w:r>
       <w:r>
-        <w:t xml:space="preserve">)/2 on the validation pairs, where P</w:t>
+        <w:t xml:space="preserve">)/2 on the validation scores, where P</w:t>
       </w:r>
       <w:r>
         <w:rPr>
@@ -3521,94 +3390,13 @@
         <w:pStyle w:val="p1a"/>
       </w:pPr>
       <w:r>
-        <w:t xml:space="preserve">Each comparison is a paired difference ΔAUC = AUC(shifted) − AUC(reference): HILL 0.4 minus WOW 0.4 under P1 (RQ1), P3 minus P2 on HILL 0.4 (RQ2), and 0.1 minus 0.4 bpp for each detector, protocol and algorithm (RQ3, 18 comparisons). Negative values mean a loss under the shift. The point estimate is the mean of the three per-seed differences, and its 95% interval comes from a paired bootstrap in which the resampling unit is the source test cover. Each of B = </w:t>
-      </w:r>
-      <w:r>
-        <w:rPr>
-          <w:highlight w:val="yellow"/>
-        </w:rPr>
-        <w:t xml:space="preserve">[number of replicates]</w:t>
-      </w:r>
-      <w:r>
-        <w:t xml:space="preserve"> replicates draws 120 cover IDs with replacement; a drawn cover brings its cover score and its stego scores under both compared conditions, so the pairing is preserved, and the same draw is applied to all three seeds. The interval is given by the 2.5th and 97.5th percentiles of the replicate seed-averaged ΔAUC </w:t>
-      </w:r>
-      <w:r>
-        <w:rPr>
-          <w:highlight w:val="yellow"/>
-        </w:rPr>
-        <w:t xml:space="preserve">[confirm against bootstrap code]</w:t>
-      </w:r>
-      <w:r>
-        <w:t xml:space="preserve">.</w:t>
+        <w:t xml:space="preserve">Each comparison is a paired difference ΔAUC = AUC(shifted) − AUC(reference): HILL 0.4 minus WOW 0.4 under P1 (RQ1), P3 minus P2 on HILL 0.4 (RQ2), and 0.1 minus 0.4 bpp for each detector, protocol and algorithm (RQ3, 18 comparisons). Negative values mean a loss under the shift. The point estimate is the mean of the three per-seed differences, which equals the difference of the seed-mean AUCs. Its 95% interval comes from a paired bootstrap in which the resampling unit is the source test cover: each replicate draws 120 test cover IDs with replacement, and a drawn cover brings its cover score together with its stego scores under both compared conditions, so the pairing is preserved. Individual stego images are never resampled on their own.</w:t>
       </w:r>
     </w:p>
     <w:p>
       <w:pPr/>
       <w:r>
-        <w:t xml:space="preserve">Seed standard deviations (at most 0.028, Supplementary Table S1) describe training randomness on fixed data; the bootstrap describes the sampling of test covers given the trained models. Neither covers another choice of covers or split, so the intervals are conditional on this partition. A direction is called supported only when its interval excludes zero; an interval containing zero is inconclusive, not evidence of equivalence. The 18 RQ3 intervals are not adjusted for multiplicity. All runs store per-image scores, the manifest and the seeds. Experiments used Python </w:t>
-      </w:r>
-      <w:r>
-        <w:rPr>
-          <w:highlight w:val="yellow"/>
-        </w:rPr>
-        <w:t xml:space="preserve">[ver.]</w:t>
-      </w:r>
-      <w:r>
-        <w:t xml:space="preserve">, NumPy </w:t>
-      </w:r>
-      <w:r>
-        <w:rPr>
-          <w:highlight w:val="yellow"/>
-        </w:rPr>
-        <w:t xml:space="preserve">[ver.]</w:t>
-      </w:r>
-      <w:r>
-        <w:t xml:space="preserve">, scikit-learn </w:t>
-      </w:r>
-      <w:r>
-        <w:rPr>
-          <w:highlight w:val="yellow"/>
-        </w:rPr>
-        <w:t xml:space="preserve">[ver.]</w:t>
-      </w:r>
-      <w:r>
-        <w:t xml:space="preserve">, sealwatch </w:t>
-      </w:r>
-      <w:r>
-        <w:rPr>
-          <w:highlight w:val="yellow"/>
-        </w:rPr>
-        <w:t xml:space="preserve">[ver.]</w:t>
-      </w:r>
-      <w:r>
-        <w:t xml:space="preserve"> and </w:t>
-      </w:r>
-      <w:r>
-        <w:rPr>
-          <w:highlight w:val="yellow"/>
-        </w:rPr>
-        <w:t xml:space="preserve">[embedding library, ver.]</w:t>
-      </w:r>
-      <w:r>
-        <w:t xml:space="preserve"> on </w:t>
-      </w:r>
-      <w:r>
-        <w:rPr>
-          <w:highlight w:val="yellow"/>
-        </w:rPr>
-        <w:t xml:space="preserve">[CPU, RAM, OS]</w:t>
-      </w:r>
-      <w:r>
-        <w:t xml:space="preserve">; code, manifest and scores are available at </w:t>
-      </w:r>
-      <w:r>
-        <w:rPr>
-          <w:highlight w:val="yellow"/>
-        </w:rPr>
-        <w:t xml:space="preserve">[repository URL or “on request”]</w:t>
-      </w:r>
-      <w:r>
-        <w:t xml:space="preserve">.</w:t>
+        <w:t xml:space="preserve">Seed standard deviations (at most 0.028, Supplementary Table S1) describe training randomness on fixed data; the bootstrap describes the sampling of test covers given the trained models. Neither covers another choice of covers or split, so the intervals are conditional on this partition. A direction is called supported only when its interval excludes zero; an interval containing zero is inconclusive, not evidence of equivalence. The 18 RQ3 intervals are not adjusted for multiplicity. Every run stores its per-image prediction scores, and the manifest stores the embedding seed and SHA-256 hash of every image, so all tables can be recomputed from the saved files.</w:t>
       </w:r>
     </w:p>
     <w:p>
@@ -5944,7 +5732,7 @@
         <w:pStyle w:val="p1a"/>
       </w:pPr>
       <w:r>
-        <w:t xml:space="preserve">P3 adds 0.1 bpp WOW and S-UNIWARD variants to the P2 pool at the same 360 pairs, which halves the expected number of 0.4 bpp training examples. On unseen HILL 0.4, SRM+Ensemble scores 0.653 under P2 and 0.632 under P3 (ΔAUC = −0.022, 95% CI [−0.050, +0.005]); for Residual-LR the difference is −0.005 [−0.020, +0.007]. Both intervals include zero, so the data show neither an improvement nor equivalence of the two protocols. For SRM+Ensemble the point estimates also fall on matched 0.4 bpp conditions (WOW 0.713 → 0.686, S-UNIWARD 0.717 → 0.677), and AUC at 0.1 bpp does not rise although 0.1 bpp is now trained on. One untested explanation is that, at fixed size, weak 0.1 bpp examples dilute the 0.4 bpp signal.</w:t>
+        <w:t xml:space="preserve">P3 adds 0.1 bpp WOW and S-UNIWARD variants to the P2 pool at the same 360 pairs, so fewer training pairs carry the stronger 0.4 bpp signal. On unseen HILL 0.4, SRM+Ensemble scores 0.653 under P2 and 0.632 under P3 (ΔAUC = −0.022, 95% CI [−0.050, +0.005]); for Residual-LR the difference is −0.005 [−0.020, +0.007]. Both intervals include zero, so the data show neither an improvement nor equivalence of the two protocols. For SRM+Ensemble the point estimates also fall on matched 0.4 bpp conditions (WOW 0.713 → 0.686, S-UNIWARD 0.717 → 0.677), and AUC at 0.1 bpp does not rise although 0.1 bpp is now trained on. One untested explanation is that, at fixed size, weak 0.1 bpp examples dilute the 0.4 bpp signal.</w:t>
       </w:r>
     </w:p>
     <w:p>

</xml_diff>

<commit_message>
Redraw figures in plain journal style
Serif font matching the Times body, square black-outlined boxes on white, no step numbers
or fills in the pipeline diagram; payload-shift chart as a standard error-bar plot with
caps, (a)/(b) panel labels, no grid and no top/right axes. Figures remain grayscale.

Co-Authored-By: Claude Opus 5.5 <noreply@anthropic.com>
Claude-Session: https://claude.ai/code/session_01N5hfqEt1Nergf7js5PTLwW
</commit_message>
<xml_diff>
--- a/manuscript/StegaGuard_revised.docx
+++ b/manuscript/StegaGuard_revised.docx
@@ -229,7 +229,7 @@
       <w:r>
         <w:drawing>
           <wp:inline distT="0" distB="0" distL="0" distR="0">
-            <wp:extent cx="4389120" cy="2560320"/>
+            <wp:extent cx="4389120" cy="2286000"/>
             <wp:docPr id="1" name="Figure 1"/>
             <wp:cNvGraphicFramePr>
               <a:graphicFrameLocks noChangeAspect="1"/>
@@ -250,7 +250,7 @@
                   <pic:spPr>
                     <a:xfrm>
                       <a:off x="0" y="0"/>
-                      <a:ext cx="4389120" cy="2560320"/>
+                      <a:ext cx="4389120" cy="2286000"/>
                     </a:xfrm>
                     <a:prstGeom prst="rect">
                       <a:avLst/>
@@ -3338,7 +3338,7 @@
         <w:pStyle w:val="p1a"/>
       </w:pPr>
       <w:r>
-        <w:t xml:space="preserve">Each comparison is a paired difference ΔAUC = AUC(shifted) − AUC(reference): HILL 0.4 minus WOW 0.4 under P1 (RQ1), P3 minus P2 on HILL 0.4 (RQ2), and 0.1 minus 0.4 bpp for each detector, protocol and algorithm (RQ3, 18 comparisons). Negative values mean a loss under the shift. The point estimate is the mean of the three per-seed differences, which equals the difference of the unrounded seed-mean AUCs (rounded table values may differ by 0.001). Its 95% interval comes from a paired bootstrap in which the resampling unit is the source test cover: each replicate draws 120 test cover IDs with replacement, and a drawn cover brings all of its cover and stego scores under both compared conditions, so the pairing is preserved. Individual stego images are never resampled on their own.</w:t>
+        <w:t xml:space="preserve">Each comparison is a paired difference ΔAUC = AUC(shifted) − AUC(reference): HILL 0.4 minus WOW 0.4 under P1 (RQ1), P3 minus P2 on HILL 0.4 (RQ2), and 0.1 minus 0.4 bpp for each detector, protocol and algorithm (RQ3, 18 comparisons). Negative values mean a loss under the shift. The point estimate is the mean of the three per-seed differences, which equals the difference of the unrounded seed-mean AUCs (rounded table values may differ by 0.001). Its 95% interval comes from a paired bootstrap in which the resampling unit is the source test cover: each replicate draws 120 test cover IDs with replacement, and a drawn cover brings all of its cover and stego scores under both compared conditions, so the pairing is preserved.</w:t>
       </w:r>
     </w:p>
     <w:p>
@@ -5746,7 +5746,7 @@
       <w:r>
         <w:drawing>
           <wp:inline distT="0" distB="0" distL="0" distR="0">
-            <wp:extent cx="4078224" cy="1633117"/>
+            <wp:extent cx="4078224" cy="1696958"/>
             <wp:docPr id="2" name="Figure 2"/>
             <wp:cNvGraphicFramePr>
               <a:graphicFrameLocks noChangeAspect="1"/>
@@ -5767,7 +5767,7 @@
                   <pic:spPr>
                     <a:xfrm>
                       <a:off x="0" y="0"/>
-                      <a:ext cx="4078224" cy="1633117"/>
+                      <a:ext cx="4078224" cy="1696958"/>
                     </a:xfrm>
                     <a:prstGeom prst="rect">
                       <a:avLst/>
@@ -5811,7 +5811,7 @@
         <w:t xml:space="preserve">. </w:t>
       </w:r>
       <w:r>
-        <w:t xml:space="preserve">Payload shift: ΔAUC = AUC(0.1 bpp) − AUC(0.4 bpp) with 95% paired bootstrap intervals. Under P1 and P2 the 0.1 bpp payload is absent from training; under P3 it is included.</w:t>
+        <w:t xml:space="preserve">Payload shift for (a) Residual-LR and (b) SRM+Ensemble: seed-mean ΔAUC = AUC(0.1 bpp) − AUC(0.4 bpp) with 95% paired bootstrap intervals. Under P1 and P2 the 0.1 bpp payload is absent from training; under P3 it is included.</w:t>
       </w:r>
     </w:p>
     <w:p>

</xml_diff>

<commit_message>
Simplify Figure 1 to a single-row flowchart
Short one- or two-line labels, two parallel detector paths, P1/P2/P3 evaluation feeding the
four evaluation branches under 'Robustness and security metrics'; no group frames or notes.

Co-Authored-By: Claude Opus 5.5 <noreply@anthropic.com>
Claude-Session: https://claude.ai/code/session_01N5hfqEt1Nergf7js5PTLwW
</commit_message>
<xml_diff>
--- a/manuscript/StegaGuard_revised.docx
+++ b/manuscript/StegaGuard_revised.docx
@@ -229,7 +229,7 @@
       <w:r>
         <w:drawing>
           <wp:inline distT="0" distB="0" distL="0" distR="0">
-            <wp:extent cx="4389120" cy="2286000"/>
+            <wp:extent cx="4389120" cy="1289304"/>
             <wp:docPr id="1" name="Figure 1"/>
             <wp:cNvGraphicFramePr>
               <a:graphicFrameLocks noChangeAspect="1"/>
@@ -250,7 +250,7 @@
                   <pic:spPr>
                     <a:xfrm>
                       <a:off x="0" y="0"/>
-                      <a:ext cx="4389120" cy="2286000"/>
+                      <a:ext cx="4389120" cy="1289304"/>
                     </a:xfrm>
                     <a:prstGeom prst="rect">
                       <a:avLst/>

</xml_diff>